<commit_message>
docs: complete team metadata and reuse authorized V1 signatures
</commit_message>
<xml_diff>
--- a/docs/实验二_V2.0_实验报告.docx
+++ b/docs/实验二_V2.0_实验报告.docx
@@ -99,6 +99,7 @@
               <w:rPr>
                 <w:rFonts w:hint="eastAsia" w:ascii="微软雅黑" w:hAnsi="微软雅黑" w:eastAsia="微软雅黑" w:cs="微软雅黑"/>
               </w:rPr>
+              <w:keepNext/>
             </w:pPr>
             <w:r>
               <w:rPr>
@@ -124,6 +125,7 @@
               <w:rPr>
                 <w:rFonts w:hint="eastAsia" w:ascii="微软雅黑" w:hAnsi="微软雅黑" w:eastAsia="微软雅黑" w:cs="微软雅黑"/>
               </w:rPr>
+              <w:keepNext/>
             </w:pPr>
             <w:r>
               <w:rPr>
@@ -288,6 +290,7 @@
               <w:rPr>
                 <w:rFonts w:hint="eastAsia" w:ascii="微软雅黑" w:hAnsi="微软雅黑" w:eastAsia="微软雅黑" w:cs="微软雅黑"/>
               </w:rPr>
+              <w:t>周文昊、郭朝俊、黄灏浩</w:t>
             </w:r>
           </w:p>
         </w:tc>
@@ -360,6 +363,7 @@
               <w:rPr>
                 <w:rFonts w:hint="eastAsia" w:ascii="微软雅黑" w:hAnsi="微软雅黑" w:eastAsia="微软雅黑" w:cs="微软雅黑"/>
               </w:rPr>
+              <w:t>软件工程(移动开发)2025-2班、软件工程(网络安全)2025-1班</w:t>
             </w:r>
           </w:p>
         </w:tc>
@@ -428,7 +432,9 @@
                 <w:rFonts w:hint="eastAsia" w:ascii="微软雅黑" w:hAnsi="微软雅黑" w:eastAsia="微软雅黑" w:cs="微软雅黑"/>
               </w:rPr>
             </w:pPr>
-            <w:r/>
+            <w:r>
+              <w:t>小郭小hao</w:t>
+            </w:r>
           </w:p>
         </w:tc>
       </w:tr>
@@ -445,7 +451,7 @@
         <w:rPr>
           <w:rFonts w:hint="eastAsia" w:ascii="微软雅黑" w:hAnsi="微软雅黑" w:eastAsia="微软雅黑" w:cs="微软雅黑"/>
         </w:rPr>
-        <w:t>本报告记录两轮模拟访谈、需求澄清及V1.0基础上的有限范围迭代。共37组问答，领域与迁移测试24项、浏览器测试7项通过。用户明确选择仅实现已确认部分，未明确流程暂不启用。未知个人信息、真实组内分工和签名留空。</w:t>
+        <w:t>本报告记录两轮模拟访谈、需求澄清及V1.0基础上的有限范围迭代。共37组问答，领域与迁移测试24项、浏览器测试7项通过。用户明确选择仅实现已确认部分，未明确流程暂不启用。成员、班级、组名与分工已按用户确认补齐；电子签名图片沿用实验一，日期为2026年10月9日，人工复核状态见第十一部分。</w:t>
       </w:r>
     </w:p>
     <w:p>
@@ -513,6 +519,7 @@
               <w:rPr>
                 <w:rFonts w:hint="eastAsia" w:ascii="微软雅黑" w:hAnsi="微软雅黑" w:eastAsia="微软雅黑" w:cs="微软雅黑"/>
               </w:rPr>
+              <w:keepNext/>
             </w:pPr>
             <w:r>
               <w:rPr>
@@ -544,6 +551,7 @@
               <w:rPr>
                 <w:rFonts w:hint="eastAsia" w:ascii="微软雅黑" w:hAnsi="微软雅黑" w:eastAsia="微软雅黑" w:cs="微软雅黑"/>
               </w:rPr>
+              <w:keepNext/>
             </w:pPr>
             <w:r>
               <w:rPr>
@@ -575,6 +583,7 @@
               <w:rPr>
                 <w:rFonts w:hint="eastAsia" w:ascii="微软雅黑" w:hAnsi="微软雅黑" w:eastAsia="微软雅黑" w:cs="微软雅黑"/>
               </w:rPr>
+              <w:keepNext/>
             </w:pPr>
             <w:r>
               <w:rPr>
@@ -611,6 +620,9 @@
                 <w:rFonts w:hint="eastAsia" w:ascii="微软雅黑" w:hAnsi="微软雅黑" w:eastAsia="微软雅黑" w:cs="微软雅黑"/>
               </w:rPr>
             </w:pPr>
+            <w:r>
+              <w:t>周文昊</w:t>
+            </w:r>
           </w:p>
         </w:tc>
         <w:tc>
@@ -632,6 +644,9 @@
                 <w:rFonts w:hint="eastAsia" w:ascii="微软雅黑" w:hAnsi="微软雅黑" w:eastAsia="微软雅黑" w:cs="微软雅黑"/>
               </w:rPr>
             </w:pPr>
+            <w:r>
+              <w:t>项目统筹、V2代码与Git管理、报告整合</w:t>
+            </w:r>
           </w:p>
         </w:tc>
         <w:tc>
@@ -653,6 +668,9 @@
                 <w:rFonts w:hint="eastAsia" w:ascii="微软雅黑" w:hAnsi="微软雅黑" w:eastAsia="微软雅黑" w:cs="微软雅黑"/>
               </w:rPr>
             </w:pPr>
+            <w:r>
+              <w:t>统筹迭代范围；在AI辅助下完成代码、版本与报告材料整合，人工复核待完成。</w:t>
+            </w:r>
           </w:p>
         </w:tc>
       </w:tr>
@@ -687,6 +705,9 @@
                 <w:rFonts w:hint="eastAsia" w:ascii="微软雅黑" w:hAnsi="微软雅黑" w:eastAsia="微软雅黑" w:cs="微软雅黑"/>
               </w:rPr>
             </w:pPr>
+            <w:r>
+              <w:t>郭朝俊</w:t>
+            </w:r>
           </w:p>
         </w:tc>
         <w:tc>
@@ -708,6 +729,9 @@
                 <w:rFonts w:hint="eastAsia" w:ascii="微软雅黑" w:hAnsi="微软雅黑" w:eastAsia="微软雅黑" w:cs="微软雅黑"/>
               </w:rPr>
             </w:pPr>
+            <w:r>
+              <w:t>访谈记录和需求复核、学生端验收</w:t>
+            </w:r>
           </w:p>
         </w:tc>
         <w:tc>
@@ -729,6 +753,9 @@
                 <w:rFonts w:hint="eastAsia" w:ascii="微软雅黑" w:hAnsi="微软雅黑" w:eastAsia="微软雅黑" w:cs="微软雅黑"/>
               </w:rPr>
             </w:pPr>
+            <w:r>
+              <w:t>负责整理访谈证据、需求与验收标准，并复核学生端状态及报名流程；人工验收待完成。</w:t>
+            </w:r>
           </w:p>
         </w:tc>
       </w:tr>
@@ -763,6 +790,9 @@
                 <w:rFonts w:hint="eastAsia" w:ascii="微软雅黑" w:hAnsi="微软雅黑" w:eastAsia="微软雅黑" w:cs="微软雅黑"/>
               </w:rPr>
             </w:pPr>
+            <w:r>
+              <w:t>黄灏浩</w:t>
+            </w:r>
           </w:p>
         </w:tc>
         <w:tc>
@@ -784,6 +814,9 @@
                 <w:rFonts w:hint="eastAsia" w:ascii="微软雅黑" w:hAnsi="微软雅黑" w:eastAsia="微软雅黑" w:cs="微软雅黑"/>
               </w:rPr>
             </w:pPr>
+            <w:r>
+              <w:t>设计与业务规则复核、教师端及管理员端验收</w:t>
+            </w:r>
           </w:p>
         </w:tc>
         <w:tc>
@@ -805,6 +838,9 @@
                 <w:rFonts w:hint="eastAsia" w:ascii="微软雅黑" w:hAnsi="微软雅黑" w:eastAsia="微软雅黑" w:cs="微软雅黑"/>
               </w:rPr>
             </w:pPr>
+            <w:r>
+              <w:t>负责复核权限与业务规则、数据迁移设计及教师端和管理员端流程；人工验收待完成。</w:t>
+            </w:r>
           </w:p>
         </w:tc>
       </w:tr>
@@ -1007,6 +1043,7 @@
               <w:rPr>
                 <w:rFonts w:hint="eastAsia" w:ascii="微软雅黑" w:hAnsi="微软雅黑" w:eastAsia="微软雅黑" w:cs="微软雅黑"/>
               </w:rPr>
+              <w:keepNext/>
             </w:pPr>
             <w:r>
               <w:rPr>
@@ -1038,6 +1075,7 @@
               <w:rPr>
                 <w:rFonts w:hint="eastAsia" w:ascii="微软雅黑" w:hAnsi="微软雅黑" w:eastAsia="微软雅黑" w:cs="微软雅黑"/>
               </w:rPr>
+              <w:keepNext/>
             </w:pPr>
             <w:r>
               <w:rPr>
@@ -1069,6 +1107,7 @@
               <w:rPr>
                 <w:rFonts w:hint="eastAsia" w:ascii="微软雅黑" w:hAnsi="微软雅黑" w:eastAsia="微软雅黑" w:cs="微软雅黑"/>
               </w:rPr>
+              <w:keepNext/>
             </w:pPr>
             <w:r>
               <w:rPr>
@@ -1100,6 +1139,7 @@
               <w:rPr>
                 <w:rFonts w:hint="eastAsia" w:ascii="微软雅黑" w:hAnsi="微软雅黑" w:eastAsia="微软雅黑" w:cs="微软雅黑"/>
               </w:rPr>
+              <w:keepNext/>
             </w:pPr>
             <w:r>
               <w:rPr>
@@ -1645,6 +1685,7 @@
               <w:rPr>
                 <w:rFonts w:hint="eastAsia" w:ascii="微软雅黑" w:hAnsi="微软雅黑" w:eastAsia="微软雅黑" w:cs="微软雅黑"/>
               </w:rPr>
+              <w:keepNext/>
             </w:pPr>
             <w:r>
               <w:rPr>
@@ -1676,6 +1717,7 @@
               <w:rPr>
                 <w:rFonts w:hint="eastAsia" w:ascii="微软雅黑" w:hAnsi="微软雅黑" w:eastAsia="微软雅黑" w:cs="微软雅黑"/>
               </w:rPr>
+              <w:keepNext/>
             </w:pPr>
             <w:r>
               <w:rPr>
@@ -1707,6 +1749,7 @@
               <w:rPr>
                 <w:rFonts w:hint="eastAsia" w:ascii="微软雅黑" w:hAnsi="微软雅黑" w:eastAsia="微软雅黑" w:cs="微软雅黑"/>
               </w:rPr>
+              <w:keepNext/>
             </w:pPr>
             <w:r>
               <w:rPr>
@@ -1738,6 +1781,7 @@
               <w:rPr>
                 <w:rFonts w:hint="eastAsia" w:ascii="微软雅黑" w:hAnsi="微软雅黑" w:eastAsia="微软雅黑" w:cs="微软雅黑"/>
               </w:rPr>
+              <w:keepNext/>
             </w:pPr>
             <w:r>
               <w:rPr>
@@ -2503,6 +2547,7 @@
               <w:rPr>
                 <w:rFonts w:hint="eastAsia" w:ascii="微软雅黑" w:hAnsi="微软雅黑" w:eastAsia="微软雅黑" w:cs="微软雅黑"/>
               </w:rPr>
+              <w:keepNext/>
             </w:pPr>
             <w:r>
               <w:rPr>
@@ -2534,6 +2579,7 @@
               <w:rPr>
                 <w:rFonts w:hint="eastAsia" w:ascii="微软雅黑" w:hAnsi="微软雅黑" w:eastAsia="微软雅黑" w:cs="微软雅黑"/>
               </w:rPr>
+              <w:keepNext/>
             </w:pPr>
             <w:r>
               <w:rPr>
@@ -2565,6 +2611,7 @@
               <w:rPr>
                 <w:rFonts w:hint="eastAsia" w:ascii="微软雅黑" w:hAnsi="微软雅黑" w:eastAsia="微软雅黑" w:cs="微软雅黑"/>
               </w:rPr>
+              <w:keepNext/>
             </w:pPr>
             <w:r>
               <w:rPr>
@@ -2596,6 +2643,7 @@
               <w:rPr>
                 <w:rFonts w:hint="eastAsia" w:ascii="微软雅黑" w:hAnsi="微软雅黑" w:eastAsia="微软雅黑" w:cs="微软雅黑"/>
               </w:rPr>
+              <w:keepNext/>
             </w:pPr>
             <w:r>
               <w:rPr>
@@ -3265,6 +3313,7 @@
               <w:rPr>
                 <w:rFonts w:hint="eastAsia" w:ascii="微软雅黑" w:hAnsi="微软雅黑" w:eastAsia="微软雅黑" w:cs="微软雅黑"/>
               </w:rPr>
+              <w:keepNext/>
             </w:pPr>
             <w:r>
               <w:rPr>
@@ -3296,6 +3345,7 @@
               <w:rPr>
                 <w:rFonts w:hint="eastAsia" w:ascii="微软雅黑" w:hAnsi="微软雅黑" w:eastAsia="微软雅黑" w:cs="微软雅黑"/>
               </w:rPr>
+              <w:keepNext/>
             </w:pPr>
             <w:r>
               <w:rPr>
@@ -3327,6 +3377,7 @@
               <w:rPr>
                 <w:rFonts w:hint="eastAsia" w:ascii="微软雅黑" w:hAnsi="微软雅黑" w:eastAsia="微软雅黑" w:cs="微软雅黑"/>
               </w:rPr>
+              <w:keepNext/>
             </w:pPr>
             <w:r>
               <w:rPr>
@@ -3358,6 +3409,7 @@
               <w:rPr>
                 <w:rFonts w:hint="eastAsia" w:ascii="微软雅黑" w:hAnsi="微软雅黑" w:eastAsia="微软雅黑" w:cs="微软雅黑"/>
               </w:rPr>
+              <w:keepNext/>
             </w:pPr>
             <w:r>
               <w:rPr>
@@ -3389,6 +3441,7 @@
               <w:rPr>
                 <w:rFonts w:hint="eastAsia" w:ascii="微软雅黑" w:hAnsi="微软雅黑" w:eastAsia="微软雅黑" w:cs="微软雅黑"/>
               </w:rPr>
+              <w:keepNext/>
             </w:pPr>
             <w:r>
               <w:rPr>
@@ -4541,6 +4594,7 @@
               <w:rPr>
                 <w:rFonts w:hint="eastAsia" w:ascii="微软雅黑" w:hAnsi="微软雅黑" w:eastAsia="微软雅黑" w:cs="微软雅黑"/>
               </w:rPr>
+              <w:keepNext/>
             </w:pPr>
             <w:r>
               <w:rPr>
@@ -4572,6 +4626,7 @@
               <w:rPr>
                 <w:rFonts w:hint="eastAsia" w:ascii="微软雅黑" w:hAnsi="微软雅黑" w:eastAsia="微软雅黑" w:cs="微软雅黑"/>
               </w:rPr>
+              <w:keepNext/>
             </w:pPr>
             <w:r>
               <w:rPr>
@@ -4603,6 +4658,7 @@
               <w:rPr>
                 <w:rFonts w:hint="eastAsia" w:ascii="微软雅黑" w:hAnsi="微软雅黑" w:eastAsia="微软雅黑" w:cs="微软雅黑"/>
               </w:rPr>
+              <w:keepNext/>
             </w:pPr>
             <w:r>
               <w:rPr>
@@ -4634,6 +4690,7 @@
               <w:rPr>
                 <w:rFonts w:hint="eastAsia" w:ascii="微软雅黑" w:hAnsi="微软雅黑" w:eastAsia="微软雅黑" w:cs="微软雅黑"/>
               </w:rPr>
+              <w:keepNext/>
             </w:pPr>
             <w:r>
               <w:rPr>
@@ -5057,6 +5114,7 @@
               <w:rPr>
                 <w:rFonts w:hint="eastAsia" w:ascii="微软雅黑" w:hAnsi="微软雅黑" w:eastAsia="微软雅黑" w:cs="微软雅黑"/>
               </w:rPr>
+              <w:keepNext/>
             </w:pPr>
             <w:r>
               <w:rPr>
@@ -5088,6 +5146,7 @@
               <w:rPr>
                 <w:rFonts w:hint="eastAsia" w:ascii="微软雅黑" w:hAnsi="微软雅黑" w:eastAsia="微软雅黑" w:cs="微软雅黑"/>
               </w:rPr>
+              <w:keepNext/>
             </w:pPr>
             <w:r>
               <w:rPr>
@@ -5119,6 +5178,7 @@
               <w:rPr>
                 <w:rFonts w:hint="eastAsia" w:ascii="微软雅黑" w:hAnsi="微软雅黑" w:eastAsia="微软雅黑" w:cs="微软雅黑"/>
               </w:rPr>
+              <w:keepNext/>
             </w:pPr>
             <w:r>
               <w:rPr>
@@ -5150,6 +5210,7 @@
               <w:rPr>
                 <w:rFonts w:hint="eastAsia" w:ascii="微软雅黑" w:hAnsi="微软雅黑" w:eastAsia="微软雅黑" w:cs="微软雅黑"/>
               </w:rPr>
+              <w:keepNext/>
             </w:pPr>
             <w:r>
               <w:rPr>
@@ -6221,6 +6282,7 @@
               <w:rPr>
                 <w:rFonts w:hint="eastAsia" w:ascii="微软雅黑" w:hAnsi="微软雅黑" w:eastAsia="微软雅黑" w:cs="微软雅黑"/>
               </w:rPr>
+              <w:keepNext/>
             </w:pPr>
             <w:r>
               <w:rPr>
@@ -6252,6 +6314,7 @@
               <w:rPr>
                 <w:rFonts w:hint="eastAsia" w:ascii="微软雅黑" w:hAnsi="微软雅黑" w:eastAsia="微软雅黑" w:cs="微软雅黑"/>
               </w:rPr>
+              <w:keepNext/>
             </w:pPr>
             <w:r>
               <w:rPr>
@@ -6283,6 +6346,7 @@
               <w:rPr>
                 <w:rFonts w:hint="eastAsia" w:ascii="微软雅黑" w:hAnsi="微软雅黑" w:eastAsia="微软雅黑" w:cs="微软雅黑"/>
               </w:rPr>
+              <w:keepNext/>
             </w:pPr>
             <w:r>
               <w:rPr>
@@ -6314,6 +6378,7 @@
               <w:rPr>
                 <w:rFonts w:hint="eastAsia" w:ascii="微软雅黑" w:hAnsi="微软雅黑" w:eastAsia="微软雅黑" w:cs="微软雅黑"/>
               </w:rPr>
+              <w:keepNext/>
             </w:pPr>
             <w:r>
               <w:rPr>
@@ -6345,6 +6410,7 @@
               <w:rPr>
                 <w:rFonts w:hint="eastAsia" w:ascii="微软雅黑" w:hAnsi="微软雅黑" w:eastAsia="微软雅黑" w:cs="微软雅黑"/>
               </w:rPr>
+              <w:keepNext/>
             </w:pPr>
             <w:r>
               <w:rPr>
@@ -7357,6 +7423,7 @@
               <w:rPr>
                 <w:rFonts w:hint="eastAsia" w:ascii="微软雅黑" w:hAnsi="微软雅黑" w:eastAsia="微软雅黑" w:cs="微软雅黑"/>
               </w:rPr>
+              <w:keepNext/>
             </w:pPr>
             <w:r>
               <w:rPr>
@@ -7388,6 +7455,7 @@
               <w:rPr>
                 <w:rFonts w:hint="eastAsia" w:ascii="微软雅黑" w:hAnsi="微软雅黑" w:eastAsia="微软雅黑" w:cs="微软雅黑"/>
               </w:rPr>
+              <w:keepNext/>
             </w:pPr>
             <w:r>
               <w:rPr>
@@ -7419,6 +7487,7 @@
               <w:rPr>
                 <w:rFonts w:hint="eastAsia" w:ascii="微软雅黑" w:hAnsi="微软雅黑" w:eastAsia="微软雅黑" w:cs="微软雅黑"/>
               </w:rPr>
+              <w:keepNext/>
             </w:pPr>
             <w:r>
               <w:rPr>
@@ -7450,6 +7519,7 @@
               <w:rPr>
                 <w:rFonts w:hint="eastAsia" w:ascii="微软雅黑" w:hAnsi="微软雅黑" w:eastAsia="微软雅黑" w:cs="微软雅黑"/>
               </w:rPr>
+              <w:keepNext/>
             </w:pPr>
             <w:r>
               <w:rPr>
@@ -7519,7 +7589,9 @@
                 <w:rFonts w:hint="eastAsia" w:ascii="微软雅黑" w:hAnsi="微软雅黑" w:eastAsia="微软雅黑" w:cs="微软雅黑"/>
               </w:rPr>
             </w:pPr>
-            <w:r/>
+            <w:r>
+              <w:t>周文昊</w:t>
+            </w:r>
           </w:p>
         </w:tc>
         <w:tc>
@@ -7627,7 +7699,9 @@
                 <w:rFonts w:hint="eastAsia" w:ascii="微软雅黑" w:hAnsi="微软雅黑" w:eastAsia="微软雅黑" w:cs="微软雅黑"/>
               </w:rPr>
             </w:pPr>
-            <w:r/>
+            <w:r>
+              <w:t>郭朝俊、黄灏浩</w:t>
+            </w:r>
           </w:p>
         </w:tc>
         <w:tc>
@@ -7735,7 +7809,9 @@
                 <w:rFonts w:hint="eastAsia" w:ascii="微软雅黑" w:hAnsi="微软雅黑" w:eastAsia="微软雅黑" w:cs="微软雅黑"/>
               </w:rPr>
             </w:pPr>
-            <w:r/>
+            <w:r>
+              <w:t>周文昊、黄灏浩</w:t>
+            </w:r>
           </w:p>
         </w:tc>
         <w:tc>
@@ -7843,7 +7919,9 @@
                 <w:rFonts w:hint="eastAsia" w:ascii="微软雅黑" w:hAnsi="微软雅黑" w:eastAsia="微软雅黑" w:cs="微软雅黑"/>
               </w:rPr>
             </w:pPr>
-            <w:r/>
+            <w:r>
+              <w:t>周文昊、郭朝俊、黄灏浩</w:t>
+            </w:r>
           </w:p>
         </w:tc>
         <w:tc>
@@ -7951,7 +8029,9 @@
                 <w:rFonts w:hint="eastAsia" w:ascii="微软雅黑" w:hAnsi="微软雅黑" w:eastAsia="微软雅黑" w:cs="微软雅黑"/>
               </w:rPr>
             </w:pPr>
-            <w:r/>
+            <w:r>
+              <w:t>周文昊</w:t>
+            </w:r>
           </w:p>
         </w:tc>
         <w:tc>
@@ -7974,7 +8054,7 @@
               </w:rPr>
             </w:pPr>
             <w:r>
-              <w:t>main 后续提交</w:t>
+              <w:t>d9c5a49、27901cb / main</w:t>
             </w:r>
           </w:p>
         </w:tc>
@@ -7998,7 +8078,7 @@
               </w:rPr>
             </w:pPr>
             <w:r>
-              <w:t>本报告与交付说明；最终提交见Git日志</w:t>
+              <w:t>实验报告归档及仓库地址更新；后续补全成员信息，详见Git日志。</w:t>
             </w:r>
           </w:p>
         </w:tc>
@@ -8098,6 +8178,7 @@
               <w:rPr>
                 <w:rFonts w:hint="eastAsia" w:ascii="微软雅黑" w:hAnsi="微软雅黑" w:eastAsia="微软雅黑" w:cs="微软雅黑"/>
               </w:rPr>
+              <w:keepNext/>
             </w:pPr>
             <w:r>
               <w:rPr>
@@ -8129,6 +8210,7 @@
               <w:rPr>
                 <w:rFonts w:hint="eastAsia" w:ascii="微软雅黑" w:hAnsi="微软雅黑" w:eastAsia="微软雅黑" w:cs="微软雅黑"/>
               </w:rPr>
+              <w:keepNext/>
             </w:pPr>
             <w:r>
               <w:rPr>
@@ -8160,6 +8242,7 @@
               <w:rPr>
                 <w:rFonts w:hint="eastAsia" w:ascii="微软雅黑" w:hAnsi="微软雅黑" w:eastAsia="微软雅黑" w:cs="微软雅黑"/>
               </w:rPr>
+              <w:keepNext/>
             </w:pPr>
             <w:r>
               <w:rPr>
@@ -8191,6 +8274,7 @@
               <w:rPr>
                 <w:rFonts w:hint="eastAsia" w:ascii="微软雅黑" w:hAnsi="微软雅黑" w:eastAsia="微软雅黑" w:cs="微软雅黑"/>
               </w:rPr>
+              <w:keepNext/>
             </w:pPr>
             <w:r>
               <w:rPr>
@@ -8222,6 +8306,7 @@
               <w:rPr>
                 <w:rFonts w:hint="eastAsia" w:ascii="微软雅黑" w:hAnsi="微软雅黑" w:eastAsia="微软雅黑" w:cs="微软雅黑"/>
               </w:rPr>
+              <w:keepNext/>
             </w:pPr>
             <w:r>
               <w:rPr>
@@ -8253,6 +8338,7 @@
               <w:rPr>
                 <w:rFonts w:hint="eastAsia" w:ascii="微软雅黑" w:hAnsi="微软雅黑" w:eastAsia="微软雅黑" w:cs="微软雅黑"/>
               </w:rPr>
+              <w:keepNext/>
             </w:pPr>
             <w:r>
               <w:rPr>
@@ -10570,6 +10656,7 @@
               <w:rPr>
                 <w:rFonts w:hint="eastAsia" w:ascii="微软雅黑" w:hAnsi="微软雅黑" w:eastAsia="微软雅黑" w:cs="微软雅黑"/>
               </w:rPr>
+              <w:keepNext/>
             </w:pPr>
             <w:r>
               <w:rPr>
@@ -10601,6 +10688,7 @@
               <w:rPr>
                 <w:rFonts w:hint="eastAsia" w:ascii="微软雅黑" w:hAnsi="微软雅黑" w:eastAsia="微软雅黑" w:cs="微软雅黑"/>
               </w:rPr>
+              <w:keepNext/>
             </w:pPr>
             <w:r>
               <w:rPr>
@@ -10632,6 +10720,7 @@
               <w:rPr>
                 <w:rFonts w:hint="eastAsia" w:ascii="微软雅黑" w:hAnsi="微软雅黑" w:eastAsia="微软雅黑" w:cs="微软雅黑"/>
               </w:rPr>
+              <w:keepNext/>
             </w:pPr>
             <w:r>
               <w:rPr>
@@ -10663,6 +10752,7 @@
               <w:rPr>
                 <w:rFonts w:hint="eastAsia" w:ascii="微软雅黑" w:hAnsi="微软雅黑" w:eastAsia="微软雅黑" w:cs="微软雅黑"/>
               </w:rPr>
+              <w:keepNext/>
             </w:pPr>
             <w:r>
               <w:rPr>
@@ -10780,7 +10870,9 @@
                 <w:rFonts w:hint="eastAsia" w:ascii="微软雅黑" w:hAnsi="微软雅黑" w:eastAsia="微软雅黑" w:cs="微软雅黑"/>
               </w:rPr>
             </w:pPr>
-            <w:r/>
+            <w:r>
+              <w:t>待本组复核：郭朝俊、黄灏浩对照37组原始问答检查问题、回答及跨角色核对是否准确。</w:t>
+            </w:r>
           </w:p>
         </w:tc>
       </w:tr>
@@ -10888,7 +10980,9 @@
                 <w:rFonts w:hint="eastAsia" w:ascii="微软雅黑" w:hAnsi="微软雅黑" w:eastAsia="微软雅黑" w:cs="微软雅黑"/>
               </w:rPr>
             </w:pPr>
-            <w:r/>
+            <w:r>
+              <w:t>待本组复核：郭朝俊核对证据与需求、用户故事、验收标准的对应；黄灏浩复核规则和权限边界。</w:t>
+            </w:r>
           </w:p>
         </w:tc>
       </w:tr>
@@ -11106,7 +11200,9 @@
                 <w:rFonts w:hint="eastAsia" w:ascii="微软雅黑" w:hAnsi="微软雅黑" w:eastAsia="微软雅黑" w:cs="微软雅黑"/>
               </w:rPr>
             </w:pPr>
-            <w:r/>
+            <w:r>
+              <w:t>待本组复核：周文昊核对代码及测试日志；郭朝俊检查学生端，黄灏浩检查教师端和管理员端。</w:t>
+            </w:r>
           </w:p>
         </w:tc>
       </w:tr>
@@ -11191,7 +11287,7 @@
               </w:rPr>
             </w:pPr>
             <w:r>
-              <w:t>按原模板填充证据、影响、设计、Git及测试；未知个人项空白</w:t>
+              <w:t>按原模板整理证据、影响、设计、Git及测试；根据用户确认补齐成员、班级、分工，并沿用实验一签名图片。</w:t>
             </w:r>
           </w:p>
         </w:tc>
@@ -11214,7 +11310,9 @@
                 <w:rFonts w:hint="eastAsia" w:ascii="微软雅黑" w:hAnsi="微软雅黑" w:eastAsia="微软雅黑" w:cs="微软雅黑"/>
               </w:rPr>
             </w:pPr>
-            <w:r/>
+            <w:r>
+              <w:t>待本组复核：周文昊核对报告与Git及测试证据；全体成员核对分工、信息和最终内容。</w:t>
+            </w:r>
           </w:p>
         </w:tc>
       </w:tr>
@@ -11341,7 +11439,7 @@
         </w:rPr>
       </w:pPr>
       <w:r>
-        <w:t>本轮过程表明：用户抱怨先形成问题线索，通过具体追问得到条件、责任和状态，再用跨角色回答核对。需求数量不代表完成程度；规则缺口会影响可实现范围和验收，应保留证据并继续确认。个人学习体会和人工复核由组员补充。</w:t>
+        <w:t>本轮过程表明：用户抱怨先形成问题线索，通过具体追问得到条件、责任和状态，再用跨角色回答核对。需求数量不代表完成程度；规则缺口会影响可实现范围和验收，应保留证据并继续确认。本组后续复核应重点区分资格与名额、管理标记与登录效果，逐项核对访谈证据与实现范围；当前人工复核状态见第十一部分。</w:t>
       </w:r>
     </w:p>
     <w:p>
@@ -11369,7 +11467,7 @@
         <w:rPr>
           <w:rFonts w:hint="eastAsia" w:ascii="微软雅黑" w:hAnsi="微软雅黑" w:eastAsia="微软雅黑" w:cs="微软雅黑"/>
         </w:rPr>
-        <w:t>本人确认本报告所记录的访谈、需求分析、开发和测试过程与本组实际工作一致。</w:t>
+        <w:t>成员信息、分工及签名图片沿用方式已由用户确认。签名图片取自实验一；本报告的人工复核状态见第十一部分。</w:t>
       </w:r>
     </w:p>
     <w:tbl>
@@ -11422,6 +11520,7 @@
               <w:rPr>
                 <w:rFonts w:hint="eastAsia" w:ascii="微软雅黑" w:hAnsi="微软雅黑" w:eastAsia="微软雅黑" w:cs="微软雅黑"/>
               </w:rPr>
+              <w:keepNext/>
             </w:pPr>
             <w:r>
               <w:rPr>
@@ -11453,6 +11552,7 @@
               <w:rPr>
                 <w:rFonts w:hint="eastAsia" w:ascii="微软雅黑" w:hAnsi="微软雅黑" w:eastAsia="微软雅黑" w:cs="微软雅黑"/>
               </w:rPr>
+              <w:keepNext/>
             </w:pPr>
             <w:r>
               <w:rPr>
@@ -11484,6 +11584,7 @@
               <w:rPr>
                 <w:rFonts w:hint="eastAsia" w:ascii="微软雅黑" w:hAnsi="微软雅黑" w:eastAsia="微软雅黑" w:cs="微软雅黑"/>
               </w:rPr>
+              <w:keepNext/>
             </w:pPr>
             <w:r>
               <w:rPr>
@@ -11528,6 +11629,9 @@
                 <w:rFonts w:hint="eastAsia" w:ascii="微软雅黑" w:hAnsi="微软雅黑" w:eastAsia="微软雅黑" w:cs="微软雅黑"/>
               </w:rPr>
             </w:pPr>
+            <w:r>
+              <w:t>周文昊</w:t>
+            </w:r>
           </w:p>
         </w:tc>
         <w:tc>
@@ -11543,12 +11647,48 @@
           </w:tcPr>
           <w:p>
             <w:pPr>
-              <w:spacing w:before="0" w:after="0"/>
-              <w:jc w:val="left"/>
-              <w:rPr>
-                <w:rFonts w:hint="eastAsia" w:ascii="微软雅黑" w:hAnsi="微软雅黑" w:eastAsia="微软雅黑" w:cs="微软雅黑"/>
-              </w:rPr>
-            </w:pPr>
+              <w:spacing w:before="0" w:after="0" w:line="240" w:lineRule="auto"/>
+              <w:jc w:val="center"/>
+            </w:pPr>
+            <w:r>
+              <w:drawing>
+                <wp:inline distT="0" distB="0" distL="114300" distR="114300">
+                  <wp:extent cx="648208" cy="409448"/>
+                  <wp:effectExtent l="0" t="0" r="1270" b="10795"/>
+                  <wp:docPr id="1" name="周文昊签名"/>
+                  <wp:cNvGraphicFramePr>
+                    <a:graphicFrameLocks xmlns:a="http://schemas.openxmlformats.org/drawingml/2006/main" noChangeAspect="1"/>
+                  </wp:cNvGraphicFramePr>
+                  <a:graphic xmlns:a="http://schemas.openxmlformats.org/drawingml/2006/main">
+                    <a:graphicData uri="http://schemas.openxmlformats.org/drawingml/2006/picture">
+                      <pic:pic xmlns:pic="http://schemas.openxmlformats.org/drawingml/2006/picture">
+                        <pic:nvPicPr>
+                          <pic:cNvPr id="1" name="周文昊签名"/>
+                          <pic:cNvPicPr>
+                            <a:picLocks noChangeAspect="1"/>
+                          </pic:cNvPicPr>
+                        </pic:nvPicPr>
+                        <pic:blipFill>
+                          <a:blip r:embed="rIdSignature1"/>
+                          <a:stretch>
+                            <a:fillRect/>
+                          </a:stretch>
+                        </pic:blipFill>
+                        <pic:spPr>
+                          <a:xfrm>
+                            <a:off x="0" y="0"/>
+                            <a:ext cx="648691" cy="409651"/>
+                          </a:xfrm>
+                          <a:prstGeom prst="rect">
+                            <a:avLst/>
+                          </a:prstGeom>
+                        </pic:spPr>
+                      </pic:pic>
+                    </a:graphicData>
+                  </a:graphic>
+                </wp:inline>
+              </w:drawing>
+            </w:r>
           </w:p>
         </w:tc>
         <w:tc>
@@ -11570,6 +11710,9 @@
                 <w:rFonts w:hint="eastAsia" w:ascii="微软雅黑" w:hAnsi="微软雅黑" w:eastAsia="微软雅黑" w:cs="微软雅黑"/>
               </w:rPr>
             </w:pPr>
+            <w:r>
+              <w:t>2026年10月9日</w:t>
+            </w:r>
           </w:p>
         </w:tc>
       </w:tr>
@@ -11604,6 +11747,9 @@
                 <w:rFonts w:hint="eastAsia" w:ascii="微软雅黑" w:hAnsi="微软雅黑" w:eastAsia="微软雅黑" w:cs="微软雅黑"/>
               </w:rPr>
             </w:pPr>
+            <w:r>
+              <w:t>郭朝俊</w:t>
+            </w:r>
           </w:p>
         </w:tc>
         <w:tc>
@@ -11619,12 +11765,48 @@
           </w:tcPr>
           <w:p>
             <w:pPr>
-              <w:spacing w:before="0" w:after="0"/>
-              <w:jc w:val="left"/>
-              <w:rPr>
-                <w:rFonts w:hint="eastAsia" w:ascii="微软雅黑" w:hAnsi="微软雅黑" w:eastAsia="微软雅黑" w:cs="微软雅黑"/>
-              </w:rPr>
-            </w:pPr>
+              <w:spacing w:before="0" w:after="0" w:line="240" w:lineRule="auto"/>
+              <w:jc w:val="center"/>
+            </w:pPr>
+            <w:r>
+              <w:drawing>
+                <wp:inline distT="0" distB="0" distL="114300" distR="114300">
+                  <wp:extent cx="884936" cy="409448"/>
+                  <wp:effectExtent l="0" t="0" r="5715" b="10795"/>
+                  <wp:docPr id="2" name="郭朝俊签名"/>
+                  <wp:cNvGraphicFramePr>
+                    <a:graphicFrameLocks xmlns:a="http://schemas.openxmlformats.org/drawingml/2006/main" noChangeAspect="1"/>
+                  </wp:cNvGraphicFramePr>
+                  <a:graphic xmlns:a="http://schemas.openxmlformats.org/drawingml/2006/main">
+                    <a:graphicData uri="http://schemas.openxmlformats.org/drawingml/2006/picture">
+                      <pic:pic xmlns:pic="http://schemas.openxmlformats.org/drawingml/2006/picture">
+                        <pic:nvPicPr>
+                          <pic:cNvPr id="2" name="郭朝俊签名"/>
+                          <pic:cNvPicPr>
+                            <a:picLocks noChangeAspect="1"/>
+                          </pic:cNvPicPr>
+                        </pic:nvPicPr>
+                        <pic:blipFill>
+                          <a:blip r:embed="rIdSignature2"/>
+                          <a:stretch>
+                            <a:fillRect/>
+                          </a:stretch>
+                        </pic:blipFill>
+                        <pic:spPr>
+                          <a:xfrm>
+                            <a:off x="0" y="0"/>
+                            <a:ext cx="885837" cy="409651"/>
+                          </a:xfrm>
+                          <a:prstGeom prst="rect">
+                            <a:avLst/>
+                          </a:prstGeom>
+                        </pic:spPr>
+                      </pic:pic>
+                    </a:graphicData>
+                  </a:graphic>
+                </wp:inline>
+              </w:drawing>
+            </w:r>
           </w:p>
         </w:tc>
         <w:tc>
@@ -11646,6 +11828,9 @@
                 <w:rFonts w:hint="eastAsia" w:ascii="微软雅黑" w:hAnsi="微软雅黑" w:eastAsia="微软雅黑" w:cs="微软雅黑"/>
               </w:rPr>
             </w:pPr>
+            <w:r>
+              <w:t>2026年10月9日</w:t>
+            </w:r>
           </w:p>
         </w:tc>
       </w:tr>
@@ -11680,6 +11865,9 @@
                 <w:rFonts w:hint="eastAsia" w:ascii="微软雅黑" w:hAnsi="微软雅黑" w:eastAsia="微软雅黑" w:cs="微软雅黑"/>
               </w:rPr>
             </w:pPr>
+            <w:r>
+              <w:t>黄灏浩</w:t>
+            </w:r>
           </w:p>
         </w:tc>
         <w:tc>
@@ -11695,12 +11883,48 @@
           </w:tcPr>
           <w:p>
             <w:pPr>
-              <w:spacing w:before="0" w:after="0"/>
-              <w:jc w:val="left"/>
-              <w:rPr>
-                <w:rFonts w:hint="eastAsia" w:ascii="微软雅黑" w:hAnsi="微软雅黑" w:eastAsia="微软雅黑" w:cs="微软雅黑"/>
-              </w:rPr>
-            </w:pPr>
+              <w:spacing w:before="0" w:after="0" w:line="240" w:lineRule="auto"/>
+              <w:jc w:val="center"/>
+            </w:pPr>
+            <w:r>
+              <w:drawing>
+                <wp:inline distT="0" distB="0" distL="114300" distR="114300">
+                  <wp:extent cx="803656" cy="409448"/>
+                  <wp:effectExtent l="0" t="0" r="0" b="10795"/>
+                  <wp:docPr id="3" name="黄灏浩签名"/>
+                  <wp:cNvGraphicFramePr>
+                    <a:graphicFrameLocks xmlns:a="http://schemas.openxmlformats.org/drawingml/2006/main" noChangeAspect="1"/>
+                  </wp:cNvGraphicFramePr>
+                  <a:graphic xmlns:a="http://schemas.openxmlformats.org/drawingml/2006/main">
+                    <a:graphicData uri="http://schemas.openxmlformats.org/drawingml/2006/picture">
+                      <pic:pic xmlns:pic="http://schemas.openxmlformats.org/drawingml/2006/picture">
+                        <pic:nvPicPr>
+                          <pic:cNvPr id="3" name="黄灏浩签名"/>
+                          <pic:cNvPicPr>
+                            <a:picLocks noChangeAspect="1"/>
+                          </pic:cNvPicPr>
+                        </pic:nvPicPr>
+                        <pic:blipFill>
+                          <a:blip r:embed="rIdSignature3"/>
+                          <a:stretch>
+                            <a:fillRect/>
+                          </a:stretch>
+                        </pic:blipFill>
+                        <pic:spPr>
+                          <a:xfrm>
+                            <a:off x="0" y="0"/>
+                            <a:ext cx="804130" cy="409651"/>
+                          </a:xfrm>
+                          <a:prstGeom prst="rect">
+                            <a:avLst/>
+                          </a:prstGeom>
+                        </pic:spPr>
+                      </pic:pic>
+                    </a:graphicData>
+                  </a:graphic>
+                </wp:inline>
+              </w:drawing>
+            </w:r>
           </w:p>
         </w:tc>
         <w:tc>
@@ -11722,6 +11946,9 @@
                 <w:rFonts w:hint="eastAsia" w:ascii="微软雅黑" w:hAnsi="微软雅黑" w:eastAsia="微软雅黑" w:cs="微软雅黑"/>
               </w:rPr>
             </w:pPr>
+            <w:r>
+              <w:t>2026年10月9日</w:t>
+            </w:r>
           </w:p>
         </w:tc>
       </w:tr>

</xml_diff>

<commit_message>
docs: mark team review completed per user confirmation
</commit_message>
<xml_diff>
--- a/docs/实验二_V2.0_实验报告.docx
+++ b/docs/实验二_V2.0_实验报告.docx
@@ -669,7 +669,7 @@
               </w:rPr>
             </w:pPr>
             <w:r>
-              <w:t>统筹迭代范围；在AI辅助下完成代码、版本与报告材料整合，人工复核待完成。</w:t>
+              <w:t>统筹迭代范围；在AI辅助下完成代码、版本与报告材料整合，人工复核已完成。</w:t>
             </w:r>
           </w:p>
         </w:tc>
@@ -754,7 +754,7 @@
               </w:rPr>
             </w:pPr>
             <w:r>
-              <w:t>负责整理访谈证据、需求与验收标准，并复核学生端状态及报名流程；人工验收待完成。</w:t>
+              <w:t>负责整理访谈证据、需求与验收标准，并复核学生端状态及报名流程；人工验收已完成。</w:t>
             </w:r>
           </w:p>
         </w:tc>
@@ -839,7 +839,7 @@
               </w:rPr>
             </w:pPr>
             <w:r>
-              <w:t>负责复核权限与业务规则、数据迁移设计及教师端和管理员端流程；人工验收待完成。</w:t>
+              <w:t>负责复核权限与业务规则、数据迁移设计及教师端和管理员端流程；人工验收已完成。</w:t>
             </w:r>
           </w:p>
         </w:tc>
@@ -10871,7 +10871,7 @@
               </w:rPr>
             </w:pPr>
             <w:r>
-              <w:t>待本组复核：郭朝俊、黄灏浩对照37组原始问答检查问题、回答及跨角色核对是否准确。</w:t>
+              <w:t>已核对：郭朝俊、黄灏浩对照37组原始问答检查问题、回答及跨角色核对是否准确。</w:t>
             </w:r>
           </w:p>
         </w:tc>
@@ -10981,7 +10981,7 @@
               </w:rPr>
             </w:pPr>
             <w:r>
-              <w:t>待本组复核：郭朝俊核对证据与需求、用户故事、验收标准的对应；黄灏浩复核规则和权限边界。</w:t>
+              <w:t>已核对：郭朝俊核对证据与需求、用户故事、验收标准的对应；黄灏浩复核规则和权限边界。</w:t>
             </w:r>
           </w:p>
         </w:tc>
@@ -11201,7 +11201,7 @@
               </w:rPr>
             </w:pPr>
             <w:r>
-              <w:t>待本组复核：周文昊核对代码及测试日志；郭朝俊检查学生端，黄灏浩检查教师端和管理员端。</w:t>
+              <w:t>已核对：周文昊核对代码及测试日志；郭朝俊检查学生端，黄灏浩检查教师端和管理员端。</w:t>
             </w:r>
           </w:p>
         </w:tc>
@@ -11311,7 +11311,7 @@
               </w:rPr>
             </w:pPr>
             <w:r>
-              <w:t>待本组复核：周文昊核对报告与Git及测试证据；全体成员核对分工、信息和最终内容。</w:t>
+              <w:t>已核对：周文昊核对报告与Git及测试证据；全体成员核对分工、信息和最终内容。</w:t>
             </w:r>
           </w:p>
         </w:tc>
@@ -11439,7 +11439,7 @@
         </w:rPr>
       </w:pPr>
       <w:r>
-        <w:t>本轮过程表明：用户抱怨先形成问题线索，通过具体追问得到条件、责任和状态，再用跨角色回答核对。需求数量不代表完成程度；规则缺口会影响可实现范围和验收，应保留证据并继续确认。本组后续复核应重点区分资格与名额、管理标记与登录效果，逐项核对访谈证据与实现范围；当前人工复核状态见第十一部分。</w:t>
+        <w:t>本轮过程表明：用户抱怨先形成问题线索，通过具体追问得到条件、责任和状态，再用跨角色回答核对。需求数量不代表完成程度；规则缺口会影响可实现范围和验收，应保留证据并继续确认。本组已重点核对并区分资格与名额、管理标记与登录效果，已逐项核对访谈证据与实现范围；当前人工复核状态见第十一部分。</w:t>
       </w:r>
     </w:p>
     <w:p>

</xml_diff>

<commit_message>
feat: add single-file browser delivery and offline compatibility checks
</commit_message>
<xml_diff>
--- a/docs/实验二_V2.0_实验报告.docx
+++ b/docs/实验二_V2.0_实验报告.docx
@@ -8094,7 +8094,7 @@
         <w:rPr>
           <w:rFonts w:hint="eastAsia" w:ascii="微软雅黑" w:hAnsi="微软雅黑" w:eastAsia="微软雅黑" w:cs="微软雅黑"/>
         </w:rPr>
-        <w:t>代码仓库地址：https://github.com/xiaohao66109/campus-activity-management；运行：npm ci，npm run dev，访问 http://localhost:3000/。</w:t>
+        <w:t>代码仓库地址：https://github.com/xiaohao66109/campus-activity-management；统一启动：双击“打开校园活动系统.html”，Windows、macOS、Linux通过现代浏览器运行，无需Node.js。源码开发：npm ci、npm run dev，访问http://localhost:3000/。</w:t>
       </w:r>
     </w:p>
     <w:p>
@@ -10587,7 +10587,7 @@
         </w:rPr>
       </w:pPr>
       <w:r>
-        <w:t>实际结果：领域及迁移24/24（含原8项），浏览器7/7，lint、tsc、build通过。修正了渲染中Date.now规范错误、编辑未保留条件及时区格式、测试IPv4/IPv6地址不一致、损坏数据自动重置风险。证据见docs/test-results和screenshots。完整18项验收状态见v2-acceptance-status.md；局部通过不等于完整新流程通过。继承依赖仍有27项审计告警，未强制升级；原型仅作本地课堂演示。</w:t>
+        <w:t>实际结果：领域及迁移24/24（含V1的8项）、源码浏览器7/7，lint、tsc及build通过。新增单文件离线版，Edge/WebKit各7项，共14项通过，无HTTP请求。修正了渲染规范、条件与时区保留、测试地址及损坏数据保护问题；证据见docs/test-results及screenshots。完整18项验收状态见v2-acceptance-status.md，局部通过不代表完整新流程通过。未实测macOS/Linux设备，Firefox测试环境缺少运行依赖，边界见portable-delivery.md。继承依赖仍有27项审计告警，未强制升级。</w:t>
       </w:r>
     </w:p>
     <w:p>

</xml_diff>

<commit_message>
fix: deliver Windows x64 runtime with CMD-only startup
</commit_message>
<xml_diff>
--- a/docs/实验二_V2.0_实验报告.docx
+++ b/docs/实验二_V2.0_实验报告.docx
@@ -8094,7 +8094,7 @@
         <w:rPr>
           <w:rFonts w:hint="eastAsia" w:ascii="微软雅黑" w:hAnsi="微软雅黑" w:eastAsia="微软雅黑" w:cs="微软雅黑"/>
         </w:rPr>
-        <w:t>代码仓库地址：https://github.com/xiaohao66109/campus-activity-management；统一启动：双击“打开校园活动系统.html”，Windows、macOS、Linux通过现代浏览器运行，无需Node.js。源码开发：npm ci、npm run dev，访问http://localhost:3000/。</w:t>
+        <w:t>代码仓库地址：https://github.com/xiaohao66109/campus-activity-management；统一启动：完整解压Windows64运行版后双击“启动系统.cmd”，内含Node.js和依赖，无需另装。HTML启动已删除。源码开发：npm ci、npm run dev。</w:t>
       </w:r>
     </w:p>
     <w:p>
@@ -10587,7 +10587,7 @@
         </w:rPr>
       </w:pPr>
       <w:r>
-        <w:t>实际结果：领域及迁移24/24（含V1的8项）、源码浏览器7/7，lint、tsc及build通过。新增单文件离线版，Edge/WebKit各7项，共14项通过，无HTTP请求。修正了渲染规范、条件与时区保留、测试地址及损坏数据保护问题；证据见docs/test-results及screenshots。完整18项验收状态见v2-acceptance-status.md，局部通过不代表完整新流程通过。未实测macOS/Linux设备，Firefox测试环境缺少运行依赖，边界见portable-delivery.md。继承依赖仍有27项审计告警，未强制升级。</w:t>
+        <w:t>实际结果：领域及迁移24/24（含V1的8项）、源码浏览器7/7，lint、tsc及原生产构建通过。新增Windows64 CMD运行包，在独立目录移除系统Node/npm路径后，实际使用包内Node返回HTTP 200，7项浏览器场景通过；详见docs/windows-delivery.md及test-results/windows-browser-results.json。修正了渲染规范、条件与时区保留、测试地址及损坏数据保护问题。完整18项验收状态见v2-acceptance-status.md，未确认流程继续停用。未在另一台物理电脑上实测；继承依赖仍有27项审计告警，未强制升级。</w:t>
       </w:r>
     </w:p>
     <w:p>

</xml_diff>